<commit_message>
add Bao Cao Tuan 3 & 4
</commit_message>
<xml_diff>
--- a/BaoCaoTuan2.docx
+++ b/BaoCaoTuan2.docx
@@ -309,21 +309,6 @@
       <w:pPr>
         <w:rPr>
           <w:rFonts w:ascii="Times New Roman" w:hAnsi="Times New Roman" w:cs="Times New Roman"/>
-        </w:rPr>
-      </w:pPr>
-      <w:r>
-        <w:rPr>
-          <w:rFonts w:ascii="Times New Roman" w:hAnsi="Times New Roman" w:cs="Times New Roman"/>
-        </w:rPr>
-        <w:pict w14:anchorId="10AA9524">
-          <v:rect id="_x0000_i1068" style="width:0;height:1.5pt" o:hralign="center" o:hrstd="t" o:hr="t" fillcolor="#a0a0a0" stroked="f"/>
-        </w:pict>
-      </w:r>
-    </w:p>
-    <w:p>
-      <w:pPr>
-        <w:rPr>
-          <w:rFonts w:ascii="Times New Roman" w:hAnsi="Times New Roman" w:cs="Times New Roman"/>
           <w:b/>
           <w:bCs/>
         </w:rPr>
@@ -428,24 +413,24 @@
         <w:rPr>
           <w:rFonts w:ascii="Times New Roman" w:hAnsi="Times New Roman" w:cs="Times New Roman"/>
         </w:rPr>
+        <w:t>Xác định hướng di chuyển chính của Player.</w:t>
+      </w:r>
+    </w:p>
+    <w:p>
+      <w:pPr>
+        <w:numPr>
+          <w:ilvl w:val="0"/>
+          <w:numId w:val="2"/>
+        </w:numPr>
+        <w:rPr>
+          <w:rFonts w:ascii="Times New Roman" w:hAnsi="Times New Roman" w:cs="Times New Roman"/>
+        </w:rPr>
+      </w:pPr>
+      <w:r>
+        <w:rPr>
+          <w:rFonts w:ascii="Times New Roman" w:hAnsi="Times New Roman" w:cs="Times New Roman"/>
+        </w:rPr>
         <w:lastRenderedPageBreak/>
-        <w:t>Xác định hướng di chuyển chính của Player.</w:t>
-      </w:r>
-    </w:p>
-    <w:p>
-      <w:pPr>
-        <w:numPr>
-          <w:ilvl w:val="0"/>
-          <w:numId w:val="2"/>
-        </w:numPr>
-        <w:rPr>
-          <w:rFonts w:ascii="Times New Roman" w:hAnsi="Times New Roman" w:cs="Times New Roman"/>
-        </w:rPr>
-      </w:pPr>
-      <w:r>
-        <w:rPr>
-          <w:rFonts w:ascii="Times New Roman" w:hAnsi="Times New Roman" w:cs="Times New Roman"/>
-        </w:rPr>
         <w:t>Bố trí các khu vực Combat và Puzzle.</w:t>
       </w:r>
     </w:p>
@@ -500,21 +485,6 @@
       <w:pPr>
         <w:rPr>
           <w:rFonts w:ascii="Times New Roman" w:hAnsi="Times New Roman" w:cs="Times New Roman"/>
-        </w:rPr>
-      </w:pPr>
-      <w:r>
-        <w:rPr>
-          <w:rFonts w:ascii="Times New Roman" w:hAnsi="Times New Roman" w:cs="Times New Roman"/>
-        </w:rPr>
-        <w:pict w14:anchorId="7B283282">
-          <v:rect id="_x0000_i1069" style="width:0;height:1.5pt" o:hralign="center" o:hrstd="t" o:hr="t" fillcolor="#a0a0a0" stroked="f"/>
-        </w:pict>
-      </w:r>
-    </w:p>
-    <w:p>
-      <w:pPr>
-        <w:rPr>
-          <w:rFonts w:ascii="Times New Roman" w:hAnsi="Times New Roman" w:cs="Times New Roman"/>
           <w:b/>
           <w:bCs/>
         </w:rPr>
@@ -659,6 +629,7 @@
           <w:rFonts w:ascii="Times New Roman" w:hAnsi="Times New Roman" w:cs="Times New Roman"/>
           <w:b/>
           <w:bCs/>
+          <w:lang w:val="vi-VN"/>
         </w:rPr>
       </w:pPr>
       <w:r>
@@ -666,6 +637,7 @@
           <w:rFonts w:ascii="Times New Roman" w:hAnsi="Times New Roman" w:cs="Times New Roman"/>
           <w:b/>
           <w:bCs/>
+          <w:lang w:val="vi-VN"/>
         </w:rPr>
         <w:t>2.4. Đức – Environment Artist</w:t>
       </w:r>
@@ -674,11 +646,13 @@
       <w:pPr>
         <w:rPr>
           <w:rFonts w:ascii="Times New Roman" w:hAnsi="Times New Roman" w:cs="Times New Roman"/>
-        </w:rPr>
-      </w:pPr>
-      <w:r>
-        <w:rPr>
-          <w:rFonts w:ascii="Times New Roman" w:hAnsi="Times New Roman" w:cs="Times New Roman"/>
+          <w:lang w:val="vi-VN"/>
+        </w:rPr>
+      </w:pPr>
+      <w:r>
+        <w:rPr>
+          <w:rFonts w:ascii="Times New Roman" w:hAnsi="Times New Roman" w:cs="Times New Roman"/>
+          <w:lang w:val="vi-VN"/>
         </w:rPr>
         <w:t>Đức phụ trách xây dựng và hoàn thiện môi trường của UMBRA.</w:t>
       </w:r>
@@ -687,11 +661,13 @@
       <w:pPr>
         <w:rPr>
           <w:rFonts w:ascii="Times New Roman" w:hAnsi="Times New Roman" w:cs="Times New Roman"/>
-        </w:rPr>
-      </w:pPr>
-      <w:r>
-        <w:rPr>
-          <w:rFonts w:ascii="Times New Roman" w:hAnsi="Times New Roman" w:cs="Times New Roman"/>
+          <w:lang w:val="vi-VN"/>
+        </w:rPr>
+      </w:pPr>
+      <w:r>
+        <w:rPr>
+          <w:rFonts w:ascii="Times New Roman" w:hAnsi="Times New Roman" w:cs="Times New Roman"/>
+          <w:lang w:val="vi-VN"/>
         </w:rPr>
         <w:t>Các công việc đã hoàn thành:</w:t>
       </w:r>
@@ -842,7 +818,6 @@
         <w:rPr>
           <w:rFonts w:ascii="Times New Roman" w:hAnsi="Times New Roman" w:cs="Times New Roman"/>
         </w:rPr>
-        <w:lastRenderedPageBreak/>
         <w:t>Môi trường trong game tạo được bối cảnh phòng thí nghiệm khoa học viễn tưởng, đồng thời hỗ trợ cho trải nghiệm khám phá và định hướng người chơi.</w:t>
       </w:r>
     </w:p>
@@ -857,21 +832,6 @@
           <w:rFonts w:ascii="Times New Roman" w:hAnsi="Times New Roman" w:cs="Times New Roman"/>
         </w:rPr>
         <w:t>Lighting và Props được sử dụng để tăng cảm giác bí ẩn và nguy hiểm trong môi trường.</w:t>
-      </w:r>
-    </w:p>
-    <w:p>
-      <w:pPr>
-        <w:rPr>
-          <w:rFonts w:ascii="Times New Roman" w:hAnsi="Times New Roman" w:cs="Times New Roman"/>
-        </w:rPr>
-      </w:pPr>
-      <w:r>
-        <w:rPr>
-          <w:rFonts w:ascii="Times New Roman" w:hAnsi="Times New Roman" w:cs="Times New Roman"/>
-        </w:rPr>
-        <w:pict w14:anchorId="73FEB1A4">
-          <v:rect id="_x0000_i1071" style="width:0;height:1.5pt" o:hralign="center" o:hrstd="t" o:hr="t" fillcolor="#a0a0a0" stroked="f"/>
-        </w:pict>
       </w:r>
     </w:p>
     <w:p>
@@ -888,6 +848,7 @@
           <w:b/>
           <w:bCs/>
         </w:rPr>
+        <w:lastRenderedPageBreak/>
         <w:t>2.5. Ngân – UI / Narrative Designer</w:t>
       </w:r>
     </w:p>
@@ -1079,21 +1040,6 @@
       <w:pPr>
         <w:rPr>
           <w:rFonts w:ascii="Times New Roman" w:hAnsi="Times New Roman" w:cs="Times New Roman"/>
-        </w:rPr>
-      </w:pPr>
-      <w:r>
-        <w:rPr>
-          <w:rFonts w:ascii="Times New Roman" w:hAnsi="Times New Roman" w:cs="Times New Roman"/>
-        </w:rPr>
-        <w:pict w14:anchorId="0CF1D851">
-          <v:rect id="_x0000_i1072" style="width:0;height:1.5pt" o:hralign="center" o:hrstd="t" o:hr="t" fillcolor="#a0a0a0" stroked="f"/>
-        </w:pict>
-      </w:r>
-    </w:p>
-    <w:p>
-      <w:pPr>
-        <w:rPr>
-          <w:rFonts w:ascii="Times New Roman" w:hAnsi="Times New Roman" w:cs="Times New Roman"/>
           <w:b/>
           <w:bCs/>
         </w:rPr>
@@ -1165,21 +1111,6 @@
       <w:pPr>
         <w:rPr>
           <w:rFonts w:ascii="Times New Roman" w:hAnsi="Times New Roman" w:cs="Times New Roman"/>
-        </w:rPr>
-      </w:pPr>
-      <w:r>
-        <w:rPr>
-          <w:rFonts w:ascii="Times New Roman" w:hAnsi="Times New Roman" w:cs="Times New Roman"/>
-        </w:rPr>
-        <w:pict w14:anchorId="35045918">
-          <v:rect id="_x0000_i1073" style="width:0;height:1.5pt" o:hralign="center" o:hrstd="t" o:hr="t" fillcolor="#a0a0a0" stroked="f"/>
-        </w:pict>
-      </w:r>
-    </w:p>
-    <w:p>
-      <w:pPr>
-        <w:rPr>
-          <w:rFonts w:ascii="Times New Roman" w:hAnsi="Times New Roman" w:cs="Times New Roman"/>
           <w:b/>
           <w:bCs/>
         </w:rPr>
@@ -1254,109 +1185,109 @@
         <w:rPr>
           <w:rFonts w:ascii="Times New Roman" w:hAnsi="Times New Roman" w:cs="Times New Roman"/>
         </w:rPr>
+        <w:t>Weapon System.</w:t>
+      </w:r>
+    </w:p>
+    <w:p>
+      <w:pPr>
+        <w:numPr>
+          <w:ilvl w:val="0"/>
+          <w:numId w:val="6"/>
+        </w:numPr>
+        <w:rPr>
+          <w:rFonts w:ascii="Times New Roman" w:hAnsi="Times New Roman" w:cs="Times New Roman"/>
+        </w:rPr>
+      </w:pPr>
+      <w:r>
+        <w:rPr>
+          <w:rFonts w:ascii="Times New Roman" w:hAnsi="Times New Roman" w:cs="Times New Roman"/>
+        </w:rPr>
+        <w:t>Ammo System.</w:t>
+      </w:r>
+    </w:p>
+    <w:p>
+      <w:pPr>
+        <w:numPr>
+          <w:ilvl w:val="0"/>
+          <w:numId w:val="6"/>
+        </w:numPr>
+        <w:rPr>
+          <w:rFonts w:ascii="Times New Roman" w:hAnsi="Times New Roman" w:cs="Times New Roman"/>
+        </w:rPr>
+      </w:pPr>
+      <w:r>
+        <w:rPr>
+          <w:rFonts w:ascii="Times New Roman" w:hAnsi="Times New Roman" w:cs="Times New Roman"/>
+        </w:rPr>
+        <w:t>Damage System.</w:t>
+      </w:r>
+    </w:p>
+    <w:p>
+      <w:pPr>
+        <w:numPr>
+          <w:ilvl w:val="0"/>
+          <w:numId w:val="6"/>
+        </w:numPr>
+        <w:rPr>
+          <w:rFonts w:ascii="Times New Roman" w:hAnsi="Times New Roman" w:cs="Times New Roman"/>
+        </w:rPr>
+      </w:pPr>
+      <w:r>
+        <w:rPr>
+          <w:rFonts w:ascii="Times New Roman" w:hAnsi="Times New Roman" w:cs="Times New Roman"/>
+        </w:rPr>
+        <w:t>Enemy System.</w:t>
+      </w:r>
+    </w:p>
+    <w:p>
+      <w:pPr>
+        <w:numPr>
+          <w:ilvl w:val="0"/>
+          <w:numId w:val="6"/>
+        </w:numPr>
+        <w:rPr>
+          <w:rFonts w:ascii="Times New Roman" w:hAnsi="Times New Roman" w:cs="Times New Roman"/>
+        </w:rPr>
+      </w:pPr>
+      <w:r>
+        <w:rPr>
+          <w:rFonts w:ascii="Times New Roman" w:hAnsi="Times New Roman" w:cs="Times New Roman"/>
+        </w:rPr>
+        <w:t>Level Design.</w:t>
+      </w:r>
+    </w:p>
+    <w:p>
+      <w:pPr>
+        <w:numPr>
+          <w:ilvl w:val="0"/>
+          <w:numId w:val="6"/>
+        </w:numPr>
+        <w:rPr>
+          <w:rFonts w:ascii="Times New Roman" w:hAnsi="Times New Roman" w:cs="Times New Roman"/>
+        </w:rPr>
+      </w:pPr>
+      <w:r>
+        <w:rPr>
+          <w:rFonts w:ascii="Times New Roman" w:hAnsi="Times New Roman" w:cs="Times New Roman"/>
+        </w:rPr>
+        <w:t>Exploration.</w:t>
+      </w:r>
+    </w:p>
+    <w:p>
+      <w:pPr>
+        <w:numPr>
+          <w:ilvl w:val="0"/>
+          <w:numId w:val="6"/>
+        </w:numPr>
+        <w:rPr>
+          <w:rFonts w:ascii="Times New Roman" w:hAnsi="Times New Roman" w:cs="Times New Roman"/>
+        </w:rPr>
+      </w:pPr>
+      <w:r>
+        <w:rPr>
+          <w:rFonts w:ascii="Times New Roman" w:hAnsi="Times New Roman" w:cs="Times New Roman"/>
+        </w:rPr>
         <w:lastRenderedPageBreak/>
-        <w:t>Weapon System.</w:t>
-      </w:r>
-    </w:p>
-    <w:p>
-      <w:pPr>
-        <w:numPr>
-          <w:ilvl w:val="0"/>
-          <w:numId w:val="6"/>
-        </w:numPr>
-        <w:rPr>
-          <w:rFonts w:ascii="Times New Roman" w:hAnsi="Times New Roman" w:cs="Times New Roman"/>
-        </w:rPr>
-      </w:pPr>
-      <w:r>
-        <w:rPr>
-          <w:rFonts w:ascii="Times New Roman" w:hAnsi="Times New Roman" w:cs="Times New Roman"/>
-        </w:rPr>
-        <w:t>Ammo System.</w:t>
-      </w:r>
-    </w:p>
-    <w:p>
-      <w:pPr>
-        <w:numPr>
-          <w:ilvl w:val="0"/>
-          <w:numId w:val="6"/>
-        </w:numPr>
-        <w:rPr>
-          <w:rFonts w:ascii="Times New Roman" w:hAnsi="Times New Roman" w:cs="Times New Roman"/>
-        </w:rPr>
-      </w:pPr>
-      <w:r>
-        <w:rPr>
-          <w:rFonts w:ascii="Times New Roman" w:hAnsi="Times New Roman" w:cs="Times New Roman"/>
-        </w:rPr>
-        <w:t>Damage System.</w:t>
-      </w:r>
-    </w:p>
-    <w:p>
-      <w:pPr>
-        <w:numPr>
-          <w:ilvl w:val="0"/>
-          <w:numId w:val="6"/>
-        </w:numPr>
-        <w:rPr>
-          <w:rFonts w:ascii="Times New Roman" w:hAnsi="Times New Roman" w:cs="Times New Roman"/>
-        </w:rPr>
-      </w:pPr>
-      <w:r>
-        <w:rPr>
-          <w:rFonts w:ascii="Times New Roman" w:hAnsi="Times New Roman" w:cs="Times New Roman"/>
-        </w:rPr>
-        <w:t>Enemy System.</w:t>
-      </w:r>
-    </w:p>
-    <w:p>
-      <w:pPr>
-        <w:numPr>
-          <w:ilvl w:val="0"/>
-          <w:numId w:val="6"/>
-        </w:numPr>
-        <w:rPr>
-          <w:rFonts w:ascii="Times New Roman" w:hAnsi="Times New Roman" w:cs="Times New Roman"/>
-        </w:rPr>
-      </w:pPr>
-      <w:r>
-        <w:rPr>
-          <w:rFonts w:ascii="Times New Roman" w:hAnsi="Times New Roman" w:cs="Times New Roman"/>
-        </w:rPr>
-        <w:t>Level Design.</w:t>
-      </w:r>
-    </w:p>
-    <w:p>
-      <w:pPr>
-        <w:numPr>
-          <w:ilvl w:val="0"/>
-          <w:numId w:val="6"/>
-        </w:numPr>
-        <w:rPr>
-          <w:rFonts w:ascii="Times New Roman" w:hAnsi="Times New Roman" w:cs="Times New Roman"/>
-        </w:rPr>
-      </w:pPr>
-      <w:r>
-        <w:rPr>
-          <w:rFonts w:ascii="Times New Roman" w:hAnsi="Times New Roman" w:cs="Times New Roman"/>
-        </w:rPr>
-        <w:t>Exploration.</w:t>
-      </w:r>
-    </w:p>
-    <w:p>
-      <w:pPr>
-        <w:numPr>
-          <w:ilvl w:val="0"/>
-          <w:numId w:val="6"/>
-        </w:numPr>
-        <w:rPr>
-          <w:rFonts w:ascii="Times New Roman" w:hAnsi="Times New Roman" w:cs="Times New Roman"/>
-        </w:rPr>
-      </w:pPr>
-      <w:r>
-        <w:rPr>
-          <w:rFonts w:ascii="Times New Roman" w:hAnsi="Times New Roman" w:cs="Times New Roman"/>
-        </w:rPr>
         <w:t>Hacking Puzzle.</w:t>
       </w:r>
     </w:p>
@@ -3059,6 +2990,7 @@
   <w:style w:type="character" w:default="1" w:styleId="DefaultParagraphFont">
     <w:name w:val="Default Paragraph Font"/>
     <w:uiPriority w:val="1"/>
+    <w:semiHidden/>
     <w:unhideWhenUsed/>
   </w:style>
   <w:style w:type="table" w:default="1" w:styleId="TableNormal">

</xml_diff>